<commit_message>
Enhance DOCX handling: update InspectActivityTable to return XML document and add WriteModifiedDocumentXML for saving changes
</commit_message>
<xml_diff>
--- a/202609012.docx
+++ b/202609012.docx
@@ -476,61 +476,61 @@
                 <w:sz w:val="20"/>
                 <w:szCs w:val="20"/>
               </w:rPr>
-              <w:t>Date:</w:t>
-            </w:r>
-            <w:r>
-              <w:rPr>
-                <w:rFonts w:cstheme="minorHAnsi"/>
-                <w:b/>
-                <w:sz w:val="20"/>
-                <w:szCs w:val="20"/>
-              </w:rPr>
-              <w:t xml:space="preserve"> </w:t>
-            </w:r>
-            <w:r>
-              <w:rPr>
-                <w:rFonts w:cstheme="minorHAnsi"/>
-                <w:b/>
-                <w:sz w:val="20"/>
-                <w:szCs w:val="20"/>
-              </w:rPr>
-              <w:t>03 August</w:t>
-            </w:r>
-            <w:r>
-              <w:rPr>
-                <w:rFonts w:cstheme="minorHAnsi"/>
-                <w:b/>
-                <w:sz w:val="20"/>
-                <w:szCs w:val="20"/>
-              </w:rPr>
-              <w:t>,</w:t>
-            </w:r>
-            <w:r>
-              <w:rPr>
-                <w:rFonts w:cstheme="minorHAnsi"/>
-                <w:b/>
-                <w:sz w:val="20"/>
-                <w:szCs w:val="20"/>
-              </w:rPr>
-              <w:t xml:space="preserve"> 202</w:t>
-            </w:r>
-            <w:r>
-              <w:rPr>
-                <w:rFonts w:cstheme="minorHAnsi"/>
-                <w:b/>
-                <w:sz w:val="20"/>
-                <w:szCs w:val="20"/>
-              </w:rPr>
-              <w:t>6</w:t>
-            </w:r>
-            <w:r>
-              <w:rPr>
-                <w:rFonts w:cstheme="minorHAnsi"/>
-                <w:b/>
-                <w:sz w:val="20"/>
-                <w:szCs w:val="20"/>
-              </w:rPr>
-              <w:t>.</w:t>
+              <w:t>Date: 01 September, 2026.</w:t>
+            </w:r>
+            <w:r>
+              <w:rPr>
+                <w:rFonts w:cstheme="minorHAnsi"/>
+                <w:b/>
+                <w:sz w:val="20"/>
+                <w:szCs w:val="20"/>
+              </w:rPr>
+              <w:t xml:space="preserve"/>
+            </w:r>
+            <w:r>
+              <w:rPr>
+                <w:rFonts w:cstheme="minorHAnsi"/>
+                <w:b/>
+                <w:sz w:val="20"/>
+                <w:szCs w:val="20"/>
+              </w:rPr>
+              <w:t/>
+            </w:r>
+            <w:r>
+              <w:rPr>
+                <w:rFonts w:cstheme="minorHAnsi"/>
+                <w:b/>
+                <w:sz w:val="20"/>
+                <w:szCs w:val="20"/>
+              </w:rPr>
+              <w:t/>
+            </w:r>
+            <w:r>
+              <w:rPr>
+                <w:rFonts w:cstheme="minorHAnsi"/>
+                <w:b/>
+                <w:sz w:val="20"/>
+                <w:szCs w:val="20"/>
+              </w:rPr>
+              <w:t xml:space="preserve"/>
+            </w:r>
+            <w:r>
+              <w:rPr>
+                <w:rFonts w:cstheme="minorHAnsi"/>
+                <w:b/>
+                <w:sz w:val="20"/>
+                <w:szCs w:val="20"/>
+              </w:rPr>
+              <w:t/>
+            </w:r>
+            <w:r>
+              <w:rPr>
+                <w:rFonts w:cstheme="minorHAnsi"/>
+                <w:b/>
+                <w:sz w:val="20"/>
+                <w:szCs w:val="20"/>
+              </w:rPr>
+              <w:t/>
             </w:r>
           </w:p>
         </w:tc>
@@ -878,6 +878,9 @@
                 <w:szCs w:val="26"/>
               </w:rPr>
             </w:pPr>
+            <w:r>
+              <w:t>07:15</w:t>
+            </w:r>
           </w:p>
         </w:tc>
         <w:tc>
@@ -893,6 +896,9 @@
                 <w:szCs w:val="26"/>
               </w:rPr>
             </w:pPr>
+            <w:r>
+              <w:t>Got updates from Mario and checked emails/shift reports.</w:t>
+            </w:r>
           </w:p>
         </w:tc>
       </w:tr>

</xml_diff>